<commit_message>
Added april 2026 lists
</commit_message>
<xml_diff>
--- a/docs/BYNATIONALITY/Цыганки.docx
+++ b/docs/BYNATIONALITY/Цыганки.docx
@@ -138,1050 +138,833 @@
       <w:pPr>
         <w:jc w:val="center"/>
         <w:rPr>
-          <w:rFonts w:hint="eastAsia"/>
-          <w:sz w:val="16"/>
-          <w:szCs w:val="16"/>
+          <w:rFonts w:ascii="Arial" w:hAnsi="Arial" w:cs="Arial"/>
+          <w:b/>
+          <w:bCs/>
+          <w:sz w:val="18"/>
+          <w:szCs w:val="18"/>
           <w:lang w:val="ru-RU"/>
         </w:rPr>
       </w:pPr>
     </w:p>
+    <w:tbl>
+      <w:tblPr>
+        <w:tblStyle w:val="TableGrid"/>
+        <w:tblW w:w="0" w:type="auto"/>
+        <w:tblLook w:val="04A0" w:firstRow="1" w:lastRow="0" w:firstColumn="1" w:lastColumn="0" w:noHBand="0" w:noVBand="1"/>
+      </w:tblPr>
+      <w:tblGrid>
+        <w:gridCol w:w="9350"/>
+      </w:tblGrid>
+      <w:tr>
+        <w:tc>
+          <w:tcPr>
+            <w:tcW w:w="9350" w:type="dxa"/>
+            <w:tcBorders>
+              <w:top w:val="nil"/>
+              <w:left w:val="nil"/>
+              <w:bottom w:val="nil"/>
+              <w:right w:val="nil"/>
+            </w:tcBorders>
+          </w:tcPr>
+          <w:p>
+            <w:pPr>
+              <w:rPr>
+                <w:rFonts w:ascii="Arial" w:hAnsi="Arial" w:cs="Arial"/>
+                <w:sz w:val="16"/>
+                <w:szCs w:val="16"/>
+                <w:lang w:val="ru-RU"/>
+              </w:rPr>
+            </w:pPr>
+            <w:r>
+              <w:rPr>
+                <w:rFonts w:ascii="Arial" w:hAnsi="Arial" w:cs="Arial"/>
+                <w:sz w:val="16"/>
+                <w:szCs w:val="16"/>
+                <w:lang w:val="ru-RU"/>
+              </w:rPr>
+              <w:t>Данный список составлен на основе открытых и доступных на интернете и сточников и не претендует быть ни полным</w:t>
+            </w:r>
+            <w:r>
+              <w:rPr>
+                <w:rFonts w:ascii="Arial" w:hAnsi="Arial" w:cs="Arial"/>
+                <w:sz w:val="16"/>
+                <w:szCs w:val="16"/>
+                <w:lang w:val="ru-RU"/>
+              </w:rPr>
+              <w:t>,</w:t>
+            </w:r>
+            <w:r>
+              <w:rPr>
+                <w:rFonts w:ascii="Arial" w:hAnsi="Arial" w:cs="Arial"/>
+                <w:sz w:val="16"/>
+                <w:szCs w:val="16"/>
+                <w:lang w:val="ru-RU"/>
+              </w:rPr>
+              <w:t xml:space="preserve"> ни окончательным. За годы </w:t>
+            </w:r>
+            <w:r>
+              <w:rPr>
+                <w:rFonts w:ascii="Arial" w:hAnsi="Arial" w:cs="Arial"/>
+                <w:sz w:val="16"/>
+                <w:szCs w:val="16"/>
+                <w:lang w:val="ru-RU"/>
+              </w:rPr>
+              <w:t>С</w:t>
+            </w:r>
+            <w:r>
+              <w:rPr>
+                <w:rFonts w:ascii="Arial" w:hAnsi="Arial" w:cs="Arial"/>
+                <w:sz w:val="16"/>
+                <w:szCs w:val="16"/>
+                <w:lang w:val="ru-RU"/>
+              </w:rPr>
+              <w:t>оветской власти в период с 19</w:t>
+            </w:r>
+            <w:r>
+              <w:rPr>
+                <w:rFonts w:ascii="Arial" w:hAnsi="Arial" w:cs="Arial"/>
+                <w:sz w:val="16"/>
+                <w:szCs w:val="16"/>
+                <w:lang w:val="ru-RU"/>
+              </w:rPr>
+              <w:t>37</w:t>
+            </w:r>
+            <w:r>
+              <w:rPr>
+                <w:rFonts w:ascii="Arial" w:hAnsi="Arial" w:cs="Arial"/>
+                <w:sz w:val="16"/>
+                <w:szCs w:val="16"/>
+                <w:lang w:val="ru-RU"/>
+              </w:rPr>
+              <w:t xml:space="preserve"> по 194</w:t>
+            </w:r>
+            <w:r>
+              <w:rPr>
+                <w:rFonts w:ascii="Arial" w:hAnsi="Arial" w:cs="Arial"/>
+                <w:sz w:val="16"/>
+                <w:szCs w:val="16"/>
+                <w:lang w:val="ru-RU"/>
+              </w:rPr>
+              <w:t>1</w:t>
+            </w:r>
+            <w:r>
+              <w:rPr>
+                <w:rFonts w:ascii="Arial" w:hAnsi="Arial" w:cs="Arial"/>
+                <w:sz w:val="16"/>
+                <w:szCs w:val="16"/>
+                <w:lang w:val="ru-RU"/>
+              </w:rPr>
+              <w:t xml:space="preserve"> гг.</w:t>
+            </w:r>
+            <w:r>
+              <w:rPr>
+                <w:rFonts w:ascii="Arial" w:hAnsi="Arial" w:cs="Arial"/>
+                <w:sz w:val="16"/>
+                <w:szCs w:val="16"/>
+                <w:lang w:val="ru-RU"/>
+              </w:rPr>
+              <w:t xml:space="preserve"> были расстреляны </w:t>
+            </w:r>
+            <w:r>
+              <w:rPr>
+                <w:rFonts w:ascii="Arial" w:hAnsi="Arial" w:cs="Arial"/>
+                <w:sz w:val="16"/>
+                <w:szCs w:val="16"/>
+                <w:lang w:val="ru-RU"/>
+              </w:rPr>
+              <w:t>1</w:t>
+            </w:r>
+            <w:r>
+              <w:rPr>
+                <w:rFonts w:ascii="Arial" w:hAnsi="Arial" w:cs="Arial"/>
+                <w:sz w:val="16"/>
+                <w:szCs w:val="16"/>
+                <w:lang w:val="ru-RU"/>
+              </w:rPr>
+              <w:t>1</w:t>
+            </w:r>
+            <w:r>
+              <w:rPr>
+                <w:rFonts w:ascii="Arial" w:hAnsi="Arial" w:cs="Arial"/>
+                <w:sz w:val="16"/>
+                <w:szCs w:val="16"/>
+                <w:lang w:val="ru-RU"/>
+              </w:rPr>
+              <w:t xml:space="preserve"> женщин-</w:t>
+            </w:r>
+            <w:r>
+              <w:rPr>
+                <w:rFonts w:ascii="Arial" w:hAnsi="Arial" w:cs="Arial"/>
+                <w:sz w:val="16"/>
+                <w:szCs w:val="16"/>
+                <w:lang w:val="ru-RU"/>
+              </w:rPr>
+              <w:t>цыганок</w:t>
+            </w:r>
+            <w:r>
+              <w:rPr>
+                <w:rFonts w:ascii="Arial" w:hAnsi="Arial" w:cs="Arial"/>
+                <w:sz w:val="16"/>
+                <w:szCs w:val="16"/>
+                <w:lang w:val="ru-RU"/>
+              </w:rPr>
+              <w:t>.</w:t>
+            </w:r>
+          </w:p>
+          <w:p>
+            <w:pPr>
+              <w:rPr>
+                <w:rFonts w:ascii="Arial" w:hAnsi="Arial" w:cs="Arial"/>
+                <w:sz w:val="16"/>
+                <w:szCs w:val="16"/>
+                <w:lang w:val="ru-RU"/>
+              </w:rPr>
+            </w:pPr>
+            <w:r>
+              <w:rPr>
+                <w:rFonts w:ascii="Arial" w:hAnsi="Arial" w:cs="Arial"/>
+                <w:b/>
+                <w:bCs/>
+                <w:sz w:val="16"/>
+                <w:szCs w:val="16"/>
+                <w:u w:val="single"/>
+                <w:lang w:val="ru-RU"/>
+              </w:rPr>
+              <w:t>Возраст</w:t>
+            </w:r>
+            <w:r>
+              <w:rPr>
+                <w:rFonts w:ascii="Arial" w:hAnsi="Arial" w:cs="Arial"/>
+                <w:b/>
+                <w:bCs/>
+                <w:sz w:val="16"/>
+                <w:szCs w:val="16"/>
+                <w:u w:val="single"/>
+                <w:lang w:val="ru-RU"/>
+              </w:rPr>
+              <w:t>н</w:t>
+            </w:r>
+            <w:r>
+              <w:rPr>
+                <w:rFonts w:ascii="Arial" w:hAnsi="Arial" w:cs="Arial"/>
+                <w:b/>
+                <w:bCs/>
+                <w:sz w:val="16"/>
+                <w:szCs w:val="16"/>
+                <w:u w:val="single"/>
+                <w:lang w:val="ru-RU"/>
+              </w:rPr>
+              <w:t>ой разброс:</w:t>
+            </w:r>
+            <w:r>
+              <w:rPr>
+                <w:rFonts w:ascii="Arial" w:hAnsi="Arial" w:cs="Arial"/>
+                <w:b/>
+                <w:bCs/>
+                <w:sz w:val="16"/>
+                <w:szCs w:val="16"/>
+                <w:lang w:val="ru-RU"/>
+              </w:rPr>
+              <w:t xml:space="preserve"> </w:t>
+            </w:r>
+            <w:r>
+              <w:rPr>
+                <w:rFonts w:ascii="Arial" w:hAnsi="Arial" w:cs="Arial"/>
+                <w:sz w:val="16"/>
+                <w:szCs w:val="16"/>
+                <w:lang w:val="ru-RU"/>
+              </w:rPr>
+              <w:t>19</w:t>
+            </w:r>
+            <w:r>
+              <w:rPr>
+                <w:rFonts w:ascii="Arial" w:hAnsi="Arial" w:cs="Arial"/>
+                <w:sz w:val="16"/>
+                <w:szCs w:val="16"/>
+                <w:lang w:val="ru-RU"/>
+              </w:rPr>
+              <w:t xml:space="preserve"> лет – 61 год</w:t>
+            </w:r>
+            <w:r>
+              <w:rPr>
+                <w:rFonts w:ascii="Arial" w:hAnsi="Arial" w:cs="Arial"/>
+                <w:sz w:val="16"/>
+                <w:szCs w:val="16"/>
+                <w:lang w:val="ru-RU"/>
+              </w:rPr>
+              <w:t>.</w:t>
+            </w:r>
+          </w:p>
+          <w:p>
+            <w:pPr>
+              <w:rPr>
+                <w:rFonts w:ascii="Arial" w:hAnsi="Arial" w:cs="Arial"/>
+                <w:sz w:val="16"/>
+                <w:szCs w:val="16"/>
+                <w:lang w:val="ru-RU"/>
+              </w:rPr>
+            </w:pPr>
+            <w:r>
+              <w:rPr>
+                <w:rFonts w:ascii="Arial" w:hAnsi="Arial" w:cs="Arial"/>
+                <w:sz w:val="16"/>
+                <w:szCs w:val="16"/>
+                <w:lang w:val="ru-RU"/>
+              </w:rPr>
+              <w:t>9</w:t>
+            </w:r>
+            <w:r>
+              <w:rPr>
+                <w:rFonts w:ascii="Arial" w:hAnsi="Arial" w:cs="Arial"/>
+                <w:sz w:val="16"/>
+                <w:szCs w:val="16"/>
+                <w:lang w:val="ru-RU"/>
+              </w:rPr>
+              <w:t xml:space="preserve"> (</w:t>
+            </w:r>
+            <w:r>
+              <w:rPr>
+                <w:rFonts w:ascii="Arial" w:hAnsi="Arial" w:cs="Arial"/>
+                <w:sz w:val="16"/>
+                <w:szCs w:val="16"/>
+                <w:lang w:val="ru-RU"/>
+              </w:rPr>
+              <w:t>82</w:t>
+            </w:r>
+            <w:r>
+              <w:rPr>
+                <w:rFonts w:ascii="Arial" w:hAnsi="Arial" w:cs="Arial"/>
+                <w:sz w:val="16"/>
+                <w:szCs w:val="16"/>
+                <w:lang w:val="ru-RU"/>
+              </w:rPr>
+              <w:t xml:space="preserve">%) </w:t>
+            </w:r>
+            <w:r>
+              <w:rPr>
+                <w:rFonts w:ascii="Arial" w:hAnsi="Arial" w:cs="Arial"/>
+                <w:sz w:val="16"/>
+                <w:szCs w:val="16"/>
+                <w:lang w:val="ru-RU"/>
+              </w:rPr>
+              <w:t>-</w:t>
+            </w:r>
+            <w:r>
+              <w:rPr>
+                <w:rFonts w:ascii="Arial" w:hAnsi="Arial" w:cs="Arial"/>
+                <w:sz w:val="16"/>
+                <w:szCs w:val="16"/>
+                <w:lang w:val="ru-RU"/>
+              </w:rPr>
+              <w:t xml:space="preserve"> расс</w:t>
+            </w:r>
+            <w:r>
+              <w:rPr>
+                <w:rFonts w:ascii="Arial" w:hAnsi="Arial" w:cs="Arial"/>
+                <w:sz w:val="16"/>
+                <w:szCs w:val="16"/>
+                <w:lang w:val="ru-RU"/>
+              </w:rPr>
+              <w:t>т</w:t>
+            </w:r>
+            <w:r>
+              <w:rPr>
+                <w:rFonts w:ascii="Arial" w:hAnsi="Arial" w:cs="Arial"/>
+                <w:sz w:val="16"/>
+                <w:szCs w:val="16"/>
+                <w:lang w:val="ru-RU"/>
+              </w:rPr>
+              <w:t>релян</w:t>
+            </w:r>
+            <w:r>
+              <w:rPr>
+                <w:rFonts w:ascii="Arial" w:hAnsi="Arial" w:cs="Arial"/>
+                <w:sz w:val="16"/>
+                <w:szCs w:val="16"/>
+                <w:lang w:val="ru-RU"/>
+              </w:rPr>
+              <w:t>ы</w:t>
+            </w:r>
+            <w:r>
+              <w:rPr>
+                <w:rFonts w:ascii="Arial" w:hAnsi="Arial" w:cs="Arial"/>
+                <w:sz w:val="16"/>
+                <w:szCs w:val="16"/>
+                <w:lang w:val="ru-RU"/>
+              </w:rPr>
+              <w:t xml:space="preserve"> в годы Большого террора</w:t>
+            </w:r>
+            <w:r>
+              <w:rPr>
+                <w:rFonts w:ascii="Arial" w:hAnsi="Arial" w:cs="Arial"/>
+                <w:sz w:val="16"/>
+                <w:szCs w:val="16"/>
+                <w:lang w:val="ru-RU"/>
+              </w:rPr>
+              <w:t xml:space="preserve"> </w:t>
+            </w:r>
+            <w:proofErr w:type="gramStart"/>
+            <w:r>
+              <w:rPr>
+                <w:rFonts w:ascii="Arial" w:hAnsi="Arial" w:cs="Arial"/>
+                <w:sz w:val="16"/>
+                <w:szCs w:val="16"/>
+                <w:lang w:val="ru-RU"/>
+              </w:rPr>
+              <w:t>1937-1938</w:t>
+            </w:r>
+            <w:proofErr w:type="gramEnd"/>
+            <w:r>
+              <w:rPr>
+                <w:rFonts w:ascii="Arial" w:hAnsi="Arial" w:cs="Arial"/>
+                <w:sz w:val="16"/>
+                <w:szCs w:val="16"/>
+                <w:lang w:val="ru-RU"/>
+              </w:rPr>
+              <w:t xml:space="preserve"> гг.</w:t>
+            </w:r>
+          </w:p>
+          <w:p>
+            <w:pPr>
+              <w:rPr>
+                <w:rFonts w:ascii="Arial" w:hAnsi="Arial" w:cs="Arial"/>
+                <w:sz w:val="16"/>
+                <w:szCs w:val="16"/>
+                <w:lang w:val="ru-RU"/>
+              </w:rPr>
+            </w:pPr>
+            <w:r>
+              <w:rPr>
+                <w:rFonts w:ascii="Arial" w:hAnsi="Arial" w:cs="Arial"/>
+                <w:b/>
+                <w:bCs/>
+                <w:sz w:val="16"/>
+                <w:szCs w:val="16"/>
+                <w:u w:val="single"/>
+                <w:lang w:val="ru-RU"/>
+              </w:rPr>
+              <w:t>Реабилитированы:</w:t>
+            </w:r>
+            <w:r>
+              <w:rPr>
+                <w:rFonts w:ascii="Arial" w:hAnsi="Arial" w:cs="Arial"/>
+                <w:sz w:val="16"/>
+                <w:szCs w:val="16"/>
+                <w:lang w:val="ru-RU"/>
+              </w:rPr>
+              <w:t xml:space="preserve"> </w:t>
+            </w:r>
+            <w:r>
+              <w:rPr>
+                <w:rFonts w:ascii="Arial" w:hAnsi="Arial" w:cs="Arial"/>
+                <w:sz w:val="16"/>
+                <w:szCs w:val="16"/>
+                <w:lang w:val="ru-RU"/>
+              </w:rPr>
+              <w:t>8</w:t>
+            </w:r>
+            <w:r>
+              <w:rPr>
+                <w:rFonts w:ascii="Arial" w:hAnsi="Arial" w:cs="Arial"/>
+                <w:sz w:val="16"/>
+                <w:szCs w:val="16"/>
+                <w:lang w:val="ru-RU"/>
+              </w:rPr>
+              <w:t>.</w:t>
+            </w:r>
+          </w:p>
+          <w:p>
+            <w:pPr>
+              <w:rPr>
+                <w:rFonts w:ascii="Arial" w:hAnsi="Arial" w:cs="Arial"/>
+                <w:sz w:val="16"/>
+                <w:szCs w:val="16"/>
+                <w:lang w:val="ru-RU"/>
+              </w:rPr>
+            </w:pPr>
+            <w:r>
+              <w:rPr>
+                <w:rFonts w:ascii="Arial" w:hAnsi="Arial" w:cs="Arial"/>
+                <w:sz w:val="16"/>
+                <w:szCs w:val="16"/>
+                <w:lang w:val="ru-RU"/>
+              </w:rPr>
+              <w:t>4 – максимальное число</w:t>
+            </w:r>
+            <w:r>
+              <w:rPr>
+                <w:rFonts w:ascii="Arial" w:hAnsi="Arial" w:cs="Arial"/>
+                <w:sz w:val="16"/>
+                <w:szCs w:val="16"/>
+                <w:lang w:val="ru-RU"/>
+              </w:rPr>
+              <w:t>,</w:t>
+            </w:r>
+            <w:r>
+              <w:rPr>
+                <w:rFonts w:ascii="Arial" w:hAnsi="Arial" w:cs="Arial"/>
+                <w:sz w:val="16"/>
+                <w:szCs w:val="16"/>
+                <w:lang w:val="ru-RU"/>
+              </w:rPr>
+              <w:t xml:space="preserve"> казнены в возрастной группе </w:t>
+            </w:r>
+            <w:proofErr w:type="gramStart"/>
+            <w:r>
+              <w:rPr>
+                <w:rFonts w:ascii="Arial" w:hAnsi="Arial" w:cs="Arial"/>
+                <w:sz w:val="16"/>
+                <w:szCs w:val="16"/>
+                <w:lang w:val="ru-RU"/>
+              </w:rPr>
+              <w:t>20</w:t>
+            </w:r>
+            <w:r>
+              <w:rPr>
+                <w:rFonts w:ascii="Arial" w:hAnsi="Arial" w:cs="Arial"/>
+                <w:sz w:val="16"/>
+                <w:szCs w:val="16"/>
+                <w:lang w:val="ru-RU"/>
+              </w:rPr>
+              <w:t>-</w:t>
+            </w:r>
+            <w:r>
+              <w:rPr>
+                <w:rFonts w:ascii="Arial" w:hAnsi="Arial" w:cs="Arial"/>
+                <w:sz w:val="16"/>
+                <w:szCs w:val="16"/>
+                <w:lang w:val="ru-RU"/>
+              </w:rPr>
+              <w:t>5</w:t>
+            </w:r>
+            <w:r>
+              <w:rPr>
+                <w:rFonts w:ascii="Arial" w:hAnsi="Arial" w:cs="Arial"/>
+                <w:sz w:val="16"/>
+                <w:szCs w:val="16"/>
+                <w:lang w:val="ru-RU"/>
+              </w:rPr>
+              <w:t>0</w:t>
+            </w:r>
+            <w:proofErr w:type="gramEnd"/>
+            <w:r>
+              <w:rPr>
+                <w:rFonts w:ascii="Arial" w:hAnsi="Arial" w:cs="Arial"/>
+                <w:sz w:val="16"/>
+                <w:szCs w:val="16"/>
+                <w:lang w:val="ru-RU"/>
+              </w:rPr>
+              <w:t xml:space="preserve"> лет</w:t>
+            </w:r>
+            <w:r>
+              <w:rPr>
+                <w:rFonts w:ascii="Arial" w:hAnsi="Arial" w:cs="Arial"/>
+                <w:sz w:val="16"/>
+                <w:szCs w:val="16"/>
+                <w:lang w:val="ru-RU"/>
+              </w:rPr>
+              <w:t>.</w:t>
+            </w:r>
+          </w:p>
+          <w:p>
+            <w:pPr>
+              <w:rPr>
+                <w:rFonts w:ascii="Arial" w:hAnsi="Arial" w:cs="Arial"/>
+                <w:sz w:val="16"/>
+                <w:szCs w:val="16"/>
+                <w:lang w:val="ru-RU"/>
+              </w:rPr>
+            </w:pPr>
+            <w:r>
+              <w:rPr>
+                <w:rFonts w:ascii="Arial" w:hAnsi="Arial" w:cs="Arial"/>
+                <w:sz w:val="16"/>
+                <w:szCs w:val="16"/>
+                <w:lang w:val="ru-RU"/>
+              </w:rPr>
+              <w:t xml:space="preserve">4 </w:t>
+            </w:r>
+            <w:r>
+              <w:rPr>
+                <w:rFonts w:ascii="Arial" w:hAnsi="Arial" w:cs="Arial"/>
+                <w:sz w:val="16"/>
+                <w:szCs w:val="16"/>
+                <w:lang w:val="ru-RU"/>
+              </w:rPr>
+              <w:t>женщины</w:t>
+            </w:r>
+            <w:r>
+              <w:rPr>
+                <w:rFonts w:ascii="Arial" w:hAnsi="Arial" w:cs="Arial"/>
+                <w:sz w:val="16"/>
+                <w:szCs w:val="16"/>
+                <w:lang w:val="ru-RU"/>
+              </w:rPr>
+              <w:t xml:space="preserve"> были заключёнными различных ИТЛ</w:t>
+            </w:r>
+            <w:r>
+              <w:rPr>
+                <w:rFonts w:ascii="Arial" w:hAnsi="Arial" w:cs="Arial"/>
+                <w:sz w:val="16"/>
+                <w:szCs w:val="16"/>
+                <w:lang w:val="ru-RU"/>
+              </w:rPr>
+              <w:t>.</w:t>
+            </w:r>
+          </w:p>
+          <w:p>
+            <w:pPr>
+              <w:rPr>
+                <w:rFonts w:ascii="Arial" w:hAnsi="Arial" w:cs="Arial"/>
+                <w:sz w:val="16"/>
+                <w:szCs w:val="16"/>
+                <w:lang w:val="ru-RU"/>
+              </w:rPr>
+            </w:pPr>
+            <w:r>
+              <w:rPr>
+                <w:rFonts w:ascii="Arial" w:hAnsi="Arial" w:cs="Arial"/>
+                <w:sz w:val="16"/>
+                <w:szCs w:val="16"/>
+                <w:lang w:val="ru-RU"/>
+              </w:rPr>
+              <w:t xml:space="preserve">Казненная в </w:t>
+            </w:r>
+            <w:r>
+              <w:rPr>
+                <w:rFonts w:ascii="Arial" w:hAnsi="Arial" w:cs="Arial"/>
+                <w:sz w:val="16"/>
+                <w:szCs w:val="16"/>
+                <w:lang w:val="ru-RU"/>
+              </w:rPr>
+              <w:t>рамках приказа 00447</w:t>
+            </w:r>
+            <w:r>
+              <w:rPr>
+                <w:rFonts w:ascii="Arial" w:hAnsi="Arial" w:cs="Arial"/>
+                <w:sz w:val="16"/>
+                <w:szCs w:val="16"/>
+                <w:lang w:val="ru-RU"/>
+              </w:rPr>
+              <w:t xml:space="preserve"> женщина была на 6 месяце беременности</w:t>
+            </w:r>
+            <w:r>
+              <w:rPr>
+                <w:rFonts w:ascii="Arial" w:hAnsi="Arial" w:cs="Arial"/>
+                <w:sz w:val="16"/>
+                <w:szCs w:val="16"/>
+                <w:lang w:val="ru-RU"/>
+              </w:rPr>
+              <w:t>.</w:t>
+            </w:r>
+          </w:p>
+          <w:p>
+            <w:pPr>
+              <w:rPr>
+                <w:rFonts w:ascii="Arial" w:hAnsi="Arial" w:cs="Arial"/>
+                <w:sz w:val="16"/>
+                <w:szCs w:val="16"/>
+                <w:lang w:val="ru-RU"/>
+              </w:rPr>
+            </w:pPr>
+            <w:r>
+              <w:rPr>
+                <w:rFonts w:ascii="Arial" w:hAnsi="Arial" w:cs="Arial"/>
+                <w:b/>
+                <w:bCs/>
+                <w:sz w:val="16"/>
+                <w:szCs w:val="16"/>
+                <w:u w:val="single"/>
+                <w:lang w:val="ru-RU"/>
+              </w:rPr>
+              <w:t>Партийность:</w:t>
+            </w:r>
+            <w:r>
+              <w:rPr>
+                <w:rFonts w:ascii="Arial" w:hAnsi="Arial" w:cs="Arial"/>
+                <w:sz w:val="16"/>
+                <w:szCs w:val="16"/>
+                <w:lang w:val="ru-RU"/>
+              </w:rPr>
+              <w:t xml:space="preserve"> </w:t>
+            </w:r>
+            <w:r>
+              <w:rPr>
+                <w:rFonts w:ascii="Arial" w:hAnsi="Arial" w:cs="Arial"/>
+                <w:sz w:val="16"/>
+                <w:szCs w:val="16"/>
+                <w:lang w:val="ru-RU"/>
+              </w:rPr>
+              <w:t>б</w:t>
+            </w:r>
+            <w:r>
+              <w:rPr>
+                <w:rFonts w:ascii="Arial" w:hAnsi="Arial" w:cs="Arial"/>
+                <w:sz w:val="16"/>
+                <w:szCs w:val="16"/>
+                <w:lang w:val="ru-RU"/>
+              </w:rPr>
+              <w:t>еспартийн</w:t>
+            </w:r>
+            <w:r>
+              <w:rPr>
+                <w:rFonts w:ascii="Arial" w:hAnsi="Arial" w:cs="Arial"/>
+                <w:sz w:val="16"/>
+                <w:szCs w:val="16"/>
+                <w:lang w:val="ru-RU"/>
+              </w:rPr>
+              <w:t>ая</w:t>
+            </w:r>
+            <w:r>
+              <w:rPr>
+                <w:rFonts w:ascii="Arial" w:hAnsi="Arial" w:cs="Arial"/>
+                <w:sz w:val="16"/>
+                <w:szCs w:val="16"/>
+                <w:lang w:val="ru-RU"/>
+              </w:rPr>
+              <w:t xml:space="preserve"> – </w:t>
+            </w:r>
+            <w:r>
+              <w:rPr>
+                <w:rFonts w:ascii="Arial" w:hAnsi="Arial" w:cs="Arial"/>
+                <w:sz w:val="16"/>
+                <w:szCs w:val="16"/>
+                <w:lang w:val="ru-RU"/>
+              </w:rPr>
+              <w:t>5</w:t>
+            </w:r>
+            <w:r>
+              <w:rPr>
+                <w:rFonts w:ascii="Arial" w:hAnsi="Arial" w:cs="Arial"/>
+                <w:sz w:val="16"/>
+                <w:szCs w:val="16"/>
+                <w:lang w:val="ru-RU"/>
+              </w:rPr>
+              <w:t>.</w:t>
+            </w:r>
+          </w:p>
+          <w:p>
+            <w:pPr>
+              <w:rPr>
+                <w:rFonts w:ascii="Arial" w:hAnsi="Arial" w:cs="Arial"/>
+                <w:sz w:val="16"/>
+                <w:szCs w:val="16"/>
+                <w:lang w:val="ru-RU"/>
+              </w:rPr>
+            </w:pPr>
+            <w:r>
+              <w:rPr>
+                <w:rFonts w:ascii="Arial" w:hAnsi="Arial" w:cs="Arial"/>
+                <w:b/>
+                <w:bCs/>
+                <w:sz w:val="16"/>
+                <w:szCs w:val="16"/>
+                <w:u w:val="single"/>
+                <w:lang w:val="ru-RU"/>
+              </w:rPr>
+              <w:t>Образование</w:t>
+            </w:r>
+            <w:r>
+              <w:rPr>
+                <w:rFonts w:ascii="Arial" w:hAnsi="Arial" w:cs="Arial"/>
+                <w:sz w:val="16"/>
+                <w:szCs w:val="16"/>
+                <w:lang w:val="ru-RU"/>
+              </w:rPr>
+              <w:t>: н</w:t>
+            </w:r>
+            <w:r>
+              <w:rPr>
+                <w:rFonts w:ascii="Arial" w:hAnsi="Arial" w:cs="Arial"/>
+                <w:sz w:val="16"/>
+                <w:szCs w:val="16"/>
+                <w:lang w:val="ru-RU"/>
+              </w:rPr>
+              <w:t>еграмотная – 5</w:t>
+            </w:r>
+            <w:r>
+              <w:rPr>
+                <w:rFonts w:ascii="Arial" w:hAnsi="Arial" w:cs="Arial"/>
+                <w:sz w:val="16"/>
+                <w:szCs w:val="16"/>
+                <w:lang w:val="ru-RU"/>
+              </w:rPr>
+              <w:t>; среднее – 1</w:t>
+            </w:r>
+            <w:r>
+              <w:rPr>
+                <w:rFonts w:ascii="Arial" w:hAnsi="Arial" w:cs="Arial"/>
+                <w:sz w:val="16"/>
+                <w:szCs w:val="16"/>
+                <w:lang w:val="ru-RU"/>
+              </w:rPr>
+              <w:t>.</w:t>
+            </w:r>
+          </w:p>
+          <w:p>
+            <w:pPr>
+              <w:rPr>
+                <w:rFonts w:ascii="Arial" w:hAnsi="Arial" w:cs="Arial"/>
+                <w:b/>
+                <w:bCs/>
+                <w:sz w:val="18"/>
+                <w:szCs w:val="18"/>
+                <w:lang w:val="ru-RU"/>
+              </w:rPr>
+            </w:pPr>
+            <w:r>
+              <w:rPr>
+                <w:rFonts w:ascii="Arial" w:hAnsi="Arial" w:cs="Arial"/>
+                <w:b/>
+                <w:bCs/>
+                <w:sz w:val="16"/>
+                <w:szCs w:val="16"/>
+                <w:u w:val="single"/>
+                <w:lang w:val="ru-RU"/>
+              </w:rPr>
+              <w:t>Профессия/социальная страта:</w:t>
+            </w:r>
+            <w:r>
+              <w:rPr>
+                <w:rFonts w:ascii="Arial" w:hAnsi="Arial" w:cs="Arial"/>
+                <w:sz w:val="16"/>
+                <w:szCs w:val="16"/>
+                <w:lang w:val="ru-RU"/>
+              </w:rPr>
+              <w:t xml:space="preserve"> </w:t>
+            </w:r>
+            <w:r>
+              <w:rPr>
+                <w:rFonts w:ascii="Arial" w:hAnsi="Arial" w:cs="Arial"/>
+                <w:sz w:val="16"/>
+                <w:szCs w:val="16"/>
+                <w:lang w:val="ru-RU"/>
+              </w:rPr>
+              <w:t>БОЗ/БОМЖ – 10</w:t>
+            </w:r>
+            <w:r>
+              <w:rPr>
+                <w:rFonts w:ascii="Arial" w:hAnsi="Arial" w:cs="Arial"/>
+                <w:sz w:val="16"/>
+                <w:szCs w:val="16"/>
+                <w:lang w:val="ru-RU"/>
+              </w:rPr>
+              <w:t>.</w:t>
+            </w:r>
+          </w:p>
+        </w:tc>
+      </w:tr>
+    </w:tbl>
     <w:p>
       <w:pPr>
-        <w:rPr>
-          <w:rFonts w:ascii="Arial" w:hAnsi="Arial" w:cs="Arial"/>
-          <w:sz w:val="16"/>
-          <w:szCs w:val="16"/>
-          <w:lang w:val="ru-RU"/>
-        </w:rPr>
-      </w:pPr>
-      <w:r>
-        <w:rPr>
-          <w:rFonts w:ascii="Arial" w:hAnsi="Arial" w:cs="Arial"/>
-          <w:sz w:val="16"/>
-          <w:szCs w:val="16"/>
-          <w:lang w:val="ru-RU"/>
-        </w:rPr>
-        <w:t>Данный список составлен на основе открытых и доступных на интернете и сточников и не претендует быть ни полным</w:t>
-      </w:r>
-      <w:r>
-        <w:rPr>
-          <w:rFonts w:ascii="Arial" w:hAnsi="Arial" w:cs="Arial"/>
-          <w:sz w:val="16"/>
-          <w:szCs w:val="16"/>
-          <w:lang w:val="ru-RU"/>
-        </w:rPr>
-        <w:t>,</w:t>
-      </w:r>
-      <w:r>
-        <w:rPr>
-          <w:rFonts w:ascii="Arial" w:hAnsi="Arial" w:cs="Arial"/>
-          <w:sz w:val="16"/>
-          <w:szCs w:val="16"/>
-          <w:lang w:val="ru-RU"/>
-        </w:rPr>
-        <w:t xml:space="preserve"> ни окончательным. За годы </w:t>
-      </w:r>
-      <w:r>
-        <w:rPr>
-          <w:rFonts w:ascii="Arial" w:hAnsi="Arial" w:cs="Arial"/>
-          <w:sz w:val="16"/>
-          <w:szCs w:val="16"/>
-          <w:lang w:val="ru-RU"/>
-        </w:rPr>
-        <w:t>С</w:t>
-      </w:r>
-      <w:r>
-        <w:rPr>
-          <w:rFonts w:ascii="Arial" w:hAnsi="Arial" w:cs="Arial"/>
-          <w:sz w:val="16"/>
-          <w:szCs w:val="16"/>
-          <w:lang w:val="ru-RU"/>
-        </w:rPr>
-        <w:t xml:space="preserve">оветской власти </w:t>
-      </w:r>
-      <w:r>
-        <w:rPr>
-          <w:rFonts w:ascii="Arial" w:hAnsi="Arial" w:cs="Arial"/>
-          <w:sz w:val="16"/>
-          <w:szCs w:val="16"/>
-          <w:lang w:val="ru-RU"/>
-        </w:rPr>
-        <w:t>в период с</w:t>
-      </w:r>
-      <w:r>
-        <w:rPr>
-          <w:rFonts w:ascii="Arial" w:hAnsi="Arial" w:cs="Arial"/>
-          <w:sz w:val="16"/>
-          <w:szCs w:val="16"/>
-          <w:lang w:val="ru-RU"/>
-        </w:rPr>
-        <w:t xml:space="preserve"> 19</w:t>
-      </w:r>
-      <w:r>
-        <w:rPr>
-          <w:rFonts w:ascii="Arial" w:hAnsi="Arial" w:cs="Arial"/>
-          <w:sz w:val="16"/>
-          <w:szCs w:val="16"/>
-          <w:lang w:val="ru-RU"/>
-        </w:rPr>
-        <w:t>37</w:t>
-      </w:r>
-      <w:r>
-        <w:rPr>
-          <w:rFonts w:ascii="Arial" w:hAnsi="Arial" w:cs="Arial"/>
-          <w:sz w:val="16"/>
-          <w:szCs w:val="16"/>
-          <w:lang w:val="ru-RU"/>
-        </w:rPr>
-        <w:t xml:space="preserve"> по 194</w:t>
-      </w:r>
-      <w:r>
-        <w:rPr>
-          <w:rFonts w:ascii="Arial" w:hAnsi="Arial" w:cs="Arial"/>
-          <w:sz w:val="16"/>
-          <w:szCs w:val="16"/>
-          <w:lang w:val="ru-RU"/>
-        </w:rPr>
-        <w:t>1</w:t>
-      </w:r>
-      <w:r>
-        <w:rPr>
-          <w:rFonts w:ascii="Arial" w:hAnsi="Arial" w:cs="Arial"/>
-          <w:sz w:val="16"/>
-          <w:szCs w:val="16"/>
-          <w:lang w:val="ru-RU"/>
-        </w:rPr>
-        <w:t xml:space="preserve"> гг.</w:t>
-      </w:r>
-      <w:r>
-        <w:rPr>
-          <w:rFonts w:ascii="Arial" w:hAnsi="Arial" w:cs="Arial"/>
-          <w:sz w:val="16"/>
-          <w:szCs w:val="16"/>
-          <w:lang w:val="ru-RU"/>
-        </w:rPr>
-        <w:t xml:space="preserve"> был</w:t>
-      </w:r>
-      <w:r>
-        <w:rPr>
-          <w:rFonts w:ascii="Arial" w:hAnsi="Arial" w:cs="Arial"/>
-          <w:sz w:val="16"/>
-          <w:szCs w:val="16"/>
-          <w:lang w:val="ru-RU"/>
-        </w:rPr>
-        <w:t>и</w:t>
-      </w:r>
-      <w:r>
-        <w:rPr>
-          <w:rFonts w:ascii="Arial" w:hAnsi="Arial" w:cs="Arial"/>
-          <w:sz w:val="16"/>
-          <w:szCs w:val="16"/>
-          <w:lang w:val="ru-RU"/>
-        </w:rPr>
-        <w:t xml:space="preserve"> расстрелян</w:t>
-      </w:r>
-      <w:r>
-        <w:rPr>
-          <w:rFonts w:ascii="Arial" w:hAnsi="Arial" w:cs="Arial"/>
-          <w:sz w:val="16"/>
-          <w:szCs w:val="16"/>
-          <w:lang w:val="ru-RU"/>
-        </w:rPr>
-        <w:t>ы</w:t>
-      </w:r>
-      <w:r>
-        <w:rPr>
-          <w:rFonts w:ascii="Arial" w:hAnsi="Arial" w:cs="Arial"/>
-          <w:sz w:val="16"/>
-          <w:szCs w:val="16"/>
-          <w:lang w:val="ru-RU"/>
-        </w:rPr>
-        <w:t xml:space="preserve"> </w:t>
-      </w:r>
-      <w:r>
-        <w:rPr>
-          <w:rFonts w:ascii="Arial" w:hAnsi="Arial" w:cs="Arial"/>
-          <w:sz w:val="16"/>
-          <w:szCs w:val="16"/>
-          <w:lang w:val="ru-RU"/>
-        </w:rPr>
-        <w:t>1</w:t>
-      </w:r>
-      <w:r>
-        <w:rPr>
-          <w:rFonts w:ascii="Arial" w:hAnsi="Arial" w:cs="Arial"/>
-          <w:sz w:val="16"/>
-          <w:szCs w:val="16"/>
-          <w:lang w:val="ru-RU"/>
-        </w:rPr>
-        <w:t>1</w:t>
-      </w:r>
-      <w:r>
-        <w:rPr>
-          <w:rFonts w:ascii="Arial" w:hAnsi="Arial" w:cs="Arial"/>
-          <w:sz w:val="16"/>
-          <w:szCs w:val="16"/>
-          <w:lang w:val="ru-RU"/>
-        </w:rPr>
-        <w:t xml:space="preserve"> женщин-</w:t>
-      </w:r>
-      <w:r>
-        <w:rPr>
-          <w:rFonts w:ascii="Arial" w:hAnsi="Arial" w:cs="Arial"/>
-          <w:sz w:val="16"/>
-          <w:szCs w:val="16"/>
-          <w:lang w:val="ru-RU"/>
-        </w:rPr>
-        <w:t>цыгано</w:t>
-      </w:r>
-      <w:r>
-        <w:rPr>
-          <w:rFonts w:ascii="Arial" w:hAnsi="Arial" w:cs="Arial"/>
-          <w:sz w:val="16"/>
-          <w:szCs w:val="16"/>
-          <w:lang w:val="ru-RU"/>
-        </w:rPr>
-        <w:t>к.</w:t>
-      </w:r>
-    </w:p>
-    <w:p>
-      <w:pPr>
-        <w:rPr>
-          <w:rFonts w:ascii="Arial" w:hAnsi="Arial" w:cs="Arial"/>
-          <w:sz w:val="16"/>
-          <w:szCs w:val="16"/>
-          <w:lang w:val="ru-RU"/>
-        </w:rPr>
-      </w:pPr>
-      <w:r>
+        <w:jc w:val="center"/>
         <w:rPr>
           <w:rFonts w:ascii="Arial" w:hAnsi="Arial" w:cs="Arial"/>
           <w:b/>
           <w:bCs/>
-          <w:sz w:val="16"/>
-          <w:szCs w:val="16"/>
-          <w:u w:val="single"/>
-          <w:lang w:val="ru-RU"/>
-        </w:rPr>
-        <w:t>Возраст</w:t>
-      </w:r>
-      <w:r>
-        <w:rPr>
-          <w:rFonts w:ascii="Arial" w:hAnsi="Arial" w:cs="Arial"/>
-          <w:b/>
-          <w:bCs/>
-          <w:sz w:val="16"/>
-          <w:szCs w:val="16"/>
-          <w:u w:val="single"/>
-          <w:lang w:val="ru-RU"/>
-        </w:rPr>
-        <w:t>н</w:t>
-      </w:r>
-      <w:r>
-        <w:rPr>
-          <w:rFonts w:ascii="Arial" w:hAnsi="Arial" w:cs="Arial"/>
-          <w:b/>
-          <w:bCs/>
-          <w:sz w:val="16"/>
-          <w:szCs w:val="16"/>
-          <w:u w:val="single"/>
-          <w:lang w:val="ru-RU"/>
-        </w:rPr>
-        <w:t xml:space="preserve">ой </w:t>
-      </w:r>
-      <w:r>
-        <w:rPr>
-          <w:rFonts w:ascii="Arial" w:hAnsi="Arial" w:cs="Arial"/>
-          <w:b/>
-          <w:bCs/>
-          <w:sz w:val="16"/>
-          <w:szCs w:val="16"/>
-          <w:u w:val="single"/>
-          <w:lang w:val="ru-RU"/>
-        </w:rPr>
-        <w:t>разброс:</w:t>
-      </w:r>
-      <w:r>
-        <w:rPr>
-          <w:rFonts w:ascii="Arial" w:hAnsi="Arial" w:cs="Arial"/>
-          <w:b/>
-          <w:bCs/>
-          <w:sz w:val="16"/>
-          <w:szCs w:val="16"/>
-          <w:lang w:val="ru-RU"/>
-        </w:rPr>
-        <w:t xml:space="preserve"> 19</w:t>
-      </w:r>
-      <w:r>
-        <w:rPr>
-          <w:rFonts w:ascii="Arial" w:hAnsi="Arial" w:cs="Arial"/>
-          <w:sz w:val="16"/>
-          <w:szCs w:val="16"/>
-          <w:lang w:val="ru-RU"/>
-        </w:rPr>
-        <w:t xml:space="preserve"> лет – 61 год</w:t>
-      </w:r>
-    </w:p>
-    <w:p>
-      <w:pPr>
-        <w:rPr>
-          <w:rFonts w:ascii="Arial" w:hAnsi="Arial" w:cs="Arial"/>
-          <w:sz w:val="16"/>
-          <w:szCs w:val="16"/>
-          <w:lang w:val="ru-RU"/>
-        </w:rPr>
-      </w:pPr>
-      <w:r>
-        <w:rPr>
-          <w:rFonts w:ascii="Arial" w:hAnsi="Arial" w:cs="Arial"/>
-          <w:sz w:val="16"/>
-          <w:szCs w:val="16"/>
-          <w:lang w:val="ru-RU"/>
-        </w:rPr>
-        <w:t>9</w:t>
-      </w:r>
-      <w:r>
-        <w:rPr>
-          <w:rFonts w:ascii="Arial" w:hAnsi="Arial" w:cs="Arial"/>
-          <w:sz w:val="16"/>
-          <w:szCs w:val="16"/>
-          <w:lang w:val="ru-RU"/>
-        </w:rPr>
-        <w:t xml:space="preserve"> (</w:t>
-      </w:r>
-      <w:r>
-        <w:rPr>
-          <w:rFonts w:ascii="Arial" w:hAnsi="Arial" w:cs="Arial"/>
-          <w:sz w:val="16"/>
-          <w:szCs w:val="16"/>
-          <w:lang w:val="ru-RU"/>
-        </w:rPr>
-        <w:t>82</w:t>
-      </w:r>
-      <w:r>
-        <w:rPr>
-          <w:rFonts w:ascii="Arial" w:hAnsi="Arial" w:cs="Arial"/>
-          <w:sz w:val="16"/>
-          <w:szCs w:val="16"/>
-          <w:lang w:val="ru-RU"/>
-        </w:rPr>
-        <w:t xml:space="preserve">%) </w:t>
-      </w:r>
-      <w:r>
-        <w:rPr>
-          <w:rFonts w:ascii="Arial" w:hAnsi="Arial" w:cs="Arial"/>
-          <w:sz w:val="16"/>
-          <w:szCs w:val="16"/>
-          <w:lang w:val="ru-RU"/>
-        </w:rPr>
-        <w:t>-</w:t>
-      </w:r>
-      <w:r>
-        <w:rPr>
-          <w:rFonts w:ascii="Arial" w:hAnsi="Arial" w:cs="Arial"/>
-          <w:sz w:val="16"/>
-          <w:szCs w:val="16"/>
-          <w:lang w:val="ru-RU"/>
-        </w:rPr>
-        <w:t xml:space="preserve"> расс</w:t>
-      </w:r>
-      <w:r>
-        <w:rPr>
-          <w:rFonts w:ascii="Arial" w:hAnsi="Arial" w:cs="Arial"/>
-          <w:sz w:val="16"/>
-          <w:szCs w:val="16"/>
-          <w:lang w:val="ru-RU"/>
-        </w:rPr>
-        <w:t>т</w:t>
-      </w:r>
-      <w:r>
-        <w:rPr>
-          <w:rFonts w:ascii="Arial" w:hAnsi="Arial" w:cs="Arial"/>
-          <w:sz w:val="16"/>
-          <w:szCs w:val="16"/>
-          <w:lang w:val="ru-RU"/>
-        </w:rPr>
-        <w:t>релян</w:t>
-      </w:r>
-      <w:r>
-        <w:rPr>
-          <w:rFonts w:ascii="Arial" w:hAnsi="Arial" w:cs="Arial"/>
-          <w:sz w:val="16"/>
-          <w:szCs w:val="16"/>
-          <w:lang w:val="ru-RU"/>
-        </w:rPr>
-        <w:t>ы</w:t>
-      </w:r>
-      <w:r>
-        <w:rPr>
-          <w:rFonts w:ascii="Arial" w:hAnsi="Arial" w:cs="Arial"/>
-          <w:sz w:val="16"/>
-          <w:szCs w:val="16"/>
-          <w:lang w:val="ru-RU"/>
-        </w:rPr>
-        <w:t xml:space="preserve"> в годы Большого террора</w:t>
-      </w:r>
-      <w:r>
-        <w:rPr>
-          <w:rFonts w:ascii="Arial" w:hAnsi="Arial" w:cs="Arial"/>
-          <w:sz w:val="16"/>
-          <w:szCs w:val="16"/>
-          <w:lang w:val="ru-RU"/>
-        </w:rPr>
-        <w:t xml:space="preserve"> </w:t>
-      </w:r>
-      <w:proofErr w:type="gramStart"/>
-      <w:r>
-        <w:rPr>
-          <w:rFonts w:ascii="Arial" w:hAnsi="Arial" w:cs="Arial"/>
-          <w:sz w:val="16"/>
-          <w:szCs w:val="16"/>
-          <w:lang w:val="ru-RU"/>
-        </w:rPr>
-        <w:t>1937-1938</w:t>
-      </w:r>
-      <w:proofErr w:type="gramEnd"/>
-      <w:r>
-        <w:rPr>
-          <w:rFonts w:ascii="Arial" w:hAnsi="Arial" w:cs="Arial"/>
-          <w:sz w:val="16"/>
-          <w:szCs w:val="16"/>
-          <w:lang w:val="ru-RU"/>
-        </w:rPr>
-        <w:t xml:space="preserve"> гг.</w:t>
-      </w:r>
-    </w:p>
-    <w:p>
-      <w:pPr>
-        <w:rPr>
-          <w:rFonts w:ascii="Arial" w:hAnsi="Arial" w:cs="Arial"/>
-          <w:sz w:val="16"/>
-          <w:szCs w:val="16"/>
-          <w:lang w:val="ru-RU"/>
-        </w:rPr>
-      </w:pPr>
-      <w:r>
-        <w:rPr>
-          <w:rFonts w:ascii="Arial" w:hAnsi="Arial" w:cs="Arial"/>
-          <w:b/>
-          <w:bCs/>
-          <w:sz w:val="16"/>
-          <w:szCs w:val="16"/>
-          <w:u w:val="single"/>
-          <w:lang w:val="ru-RU"/>
-        </w:rPr>
-        <w:t>Реабилитированы:</w:t>
-      </w:r>
-      <w:r>
-        <w:rPr>
-          <w:rFonts w:ascii="Arial" w:hAnsi="Arial" w:cs="Arial"/>
-          <w:sz w:val="16"/>
-          <w:szCs w:val="16"/>
-          <w:lang w:val="ru-RU"/>
-        </w:rPr>
-        <w:t xml:space="preserve"> </w:t>
-      </w:r>
-      <w:r>
-        <w:rPr>
-          <w:rFonts w:ascii="Arial" w:hAnsi="Arial" w:cs="Arial"/>
-          <w:sz w:val="16"/>
-          <w:szCs w:val="16"/>
-          <w:lang w:val="ru-RU"/>
-        </w:rPr>
-        <w:t>8</w:t>
-      </w:r>
-      <w:r>
-        <w:rPr>
-          <w:rFonts w:ascii="Arial" w:hAnsi="Arial" w:cs="Arial"/>
-          <w:sz w:val="16"/>
-          <w:szCs w:val="16"/>
-          <w:lang w:val="ru-RU"/>
-        </w:rPr>
-        <w:t>.</w:t>
-      </w:r>
-    </w:p>
-    <w:p>
-      <w:pPr>
-        <w:rPr>
-          <w:rFonts w:ascii="Arial" w:hAnsi="Arial" w:cs="Arial"/>
-          <w:sz w:val="16"/>
-          <w:szCs w:val="16"/>
-          <w:lang w:val="ru-RU"/>
-        </w:rPr>
-      </w:pPr>
-      <w:r>
-        <w:rPr>
-          <w:rFonts w:ascii="Arial" w:hAnsi="Arial" w:cs="Arial"/>
-          <w:b/>
-          <w:bCs/>
-          <w:sz w:val="16"/>
-          <w:szCs w:val="16"/>
-          <w:u w:val="single"/>
-          <w:lang w:val="ru-RU"/>
-        </w:rPr>
-        <w:t xml:space="preserve">Максимальное </w:t>
-      </w:r>
-      <w:r>
-        <w:rPr>
-          <w:rFonts w:ascii="Arial" w:hAnsi="Arial" w:cs="Arial"/>
-          <w:b/>
-          <w:bCs/>
-          <w:sz w:val="16"/>
-          <w:szCs w:val="16"/>
-          <w:u w:val="single"/>
-          <w:lang w:val="ru-RU"/>
-        </w:rPr>
-        <w:t>число</w:t>
-      </w:r>
-      <w:r>
-        <w:rPr>
-          <w:rFonts w:ascii="Arial" w:hAnsi="Arial" w:cs="Arial"/>
-          <w:b/>
-          <w:bCs/>
-          <w:sz w:val="16"/>
-          <w:szCs w:val="16"/>
-          <w:u w:val="single"/>
-          <w:lang w:val="ru-RU"/>
-        </w:rPr>
-        <w:t>:</w:t>
-      </w:r>
-      <w:r>
-        <w:rPr>
-          <w:rFonts w:ascii="Arial" w:hAnsi="Arial" w:cs="Arial"/>
-          <w:sz w:val="16"/>
-          <w:szCs w:val="16"/>
-          <w:lang w:val="ru-RU"/>
-        </w:rPr>
-        <w:t xml:space="preserve"> 6</w:t>
-      </w:r>
-      <w:r>
-        <w:rPr>
-          <w:rFonts w:ascii="Arial" w:hAnsi="Arial" w:cs="Arial"/>
-          <w:sz w:val="16"/>
-          <w:szCs w:val="16"/>
-          <w:lang w:val="ru-RU"/>
-        </w:rPr>
-        <w:t xml:space="preserve"> </w:t>
-      </w:r>
-      <w:r>
-        <w:rPr>
-          <w:rFonts w:ascii="Arial" w:hAnsi="Arial" w:cs="Arial"/>
-          <w:sz w:val="16"/>
-          <w:szCs w:val="16"/>
-          <w:lang w:val="ru-RU"/>
-        </w:rPr>
-        <w:t>казнены</w:t>
-      </w:r>
-      <w:r>
-        <w:rPr>
-          <w:rFonts w:ascii="Arial" w:hAnsi="Arial" w:cs="Arial"/>
-          <w:sz w:val="16"/>
-          <w:szCs w:val="16"/>
-          <w:lang w:val="ru-RU"/>
-        </w:rPr>
-        <w:t xml:space="preserve"> в 1938 году</w:t>
-      </w:r>
-    </w:p>
-    <w:p>
-      <w:pPr>
-        <w:rPr>
-          <w:rFonts w:ascii="Arial" w:hAnsi="Arial" w:cs="Arial"/>
-          <w:sz w:val="16"/>
-          <w:szCs w:val="16"/>
-          <w:lang w:val="ru-RU"/>
-        </w:rPr>
-      </w:pPr>
-      <w:r>
-        <w:rPr>
-          <w:rFonts w:ascii="Arial" w:hAnsi="Arial" w:cs="Arial"/>
-          <w:sz w:val="16"/>
-          <w:szCs w:val="16"/>
-          <w:lang w:val="ru-RU"/>
-        </w:rPr>
-        <w:t>4 – максимальное число</w:t>
-      </w:r>
-      <w:r>
-        <w:rPr>
-          <w:rFonts w:ascii="Arial" w:hAnsi="Arial" w:cs="Arial"/>
-          <w:sz w:val="16"/>
-          <w:szCs w:val="16"/>
-          <w:lang w:val="ru-RU"/>
-        </w:rPr>
-        <w:t>,</w:t>
-      </w:r>
-      <w:r>
-        <w:rPr>
-          <w:rFonts w:ascii="Arial" w:hAnsi="Arial" w:cs="Arial"/>
-          <w:sz w:val="16"/>
-          <w:szCs w:val="16"/>
-          <w:lang w:val="ru-RU"/>
-        </w:rPr>
-        <w:t xml:space="preserve"> казнены в возрастной группе </w:t>
-      </w:r>
-      <w:proofErr w:type="gramStart"/>
-      <w:r>
-        <w:rPr>
-          <w:rFonts w:ascii="Arial" w:hAnsi="Arial" w:cs="Arial"/>
-          <w:sz w:val="16"/>
-          <w:szCs w:val="16"/>
-          <w:lang w:val="ru-RU"/>
-        </w:rPr>
-        <w:t>20</w:t>
-      </w:r>
-      <w:r>
-        <w:rPr>
-          <w:rFonts w:ascii="Arial" w:hAnsi="Arial" w:cs="Arial"/>
-          <w:sz w:val="16"/>
-          <w:szCs w:val="16"/>
-          <w:lang w:val="ru-RU"/>
-        </w:rPr>
-        <w:t>-</w:t>
-      </w:r>
-      <w:r>
-        <w:rPr>
-          <w:rFonts w:ascii="Arial" w:hAnsi="Arial" w:cs="Arial"/>
-          <w:sz w:val="16"/>
-          <w:szCs w:val="16"/>
-          <w:lang w:val="ru-RU"/>
-        </w:rPr>
-        <w:t>5</w:t>
-      </w:r>
-      <w:r>
-        <w:rPr>
-          <w:rFonts w:ascii="Arial" w:hAnsi="Arial" w:cs="Arial"/>
-          <w:sz w:val="16"/>
-          <w:szCs w:val="16"/>
-          <w:lang w:val="ru-RU"/>
-        </w:rPr>
-        <w:t>0</w:t>
-      </w:r>
-      <w:proofErr w:type="gramEnd"/>
-      <w:r>
-        <w:rPr>
-          <w:rFonts w:ascii="Arial" w:hAnsi="Arial" w:cs="Arial"/>
-          <w:sz w:val="16"/>
-          <w:szCs w:val="16"/>
-          <w:lang w:val="ru-RU"/>
-        </w:rPr>
-        <w:t xml:space="preserve"> лет.</w:t>
-      </w:r>
-    </w:p>
-    <w:p>
-      <w:pPr>
-        <w:rPr>
-          <w:rFonts w:ascii="Arial" w:hAnsi="Arial" w:cs="Arial"/>
-          <w:sz w:val="16"/>
-          <w:szCs w:val="16"/>
-          <w:lang w:val="ru-RU"/>
-        </w:rPr>
-      </w:pPr>
-      <w:r>
-        <w:rPr>
-          <w:rFonts w:ascii="Arial" w:hAnsi="Arial" w:cs="Arial"/>
-          <w:sz w:val="16"/>
-          <w:szCs w:val="16"/>
-          <w:lang w:val="ru-RU"/>
-        </w:rPr>
-        <w:t xml:space="preserve">4 </w:t>
-      </w:r>
-      <w:r>
-        <w:rPr>
-          <w:rFonts w:ascii="Arial" w:hAnsi="Arial" w:cs="Arial"/>
-          <w:sz w:val="16"/>
-          <w:szCs w:val="16"/>
-          <w:lang w:val="ru-RU"/>
-        </w:rPr>
-        <w:t>женщины</w:t>
-      </w:r>
-      <w:r>
-        <w:rPr>
-          <w:rFonts w:ascii="Arial" w:hAnsi="Arial" w:cs="Arial"/>
-          <w:sz w:val="16"/>
-          <w:szCs w:val="16"/>
-          <w:lang w:val="ru-RU"/>
-        </w:rPr>
-        <w:t xml:space="preserve"> </w:t>
-      </w:r>
-      <w:r>
-        <w:rPr>
-          <w:rFonts w:ascii="Arial" w:hAnsi="Arial" w:cs="Arial"/>
-          <w:sz w:val="16"/>
-          <w:szCs w:val="16"/>
-          <w:lang w:val="ru-RU"/>
-        </w:rPr>
-        <w:t xml:space="preserve">были </w:t>
-      </w:r>
-      <w:r>
-        <w:rPr>
-          <w:rFonts w:ascii="Arial" w:hAnsi="Arial" w:cs="Arial"/>
-          <w:sz w:val="16"/>
-          <w:szCs w:val="16"/>
-          <w:lang w:val="ru-RU"/>
-        </w:rPr>
-        <w:t>заключёнными</w:t>
-      </w:r>
-      <w:r>
-        <w:rPr>
-          <w:rFonts w:ascii="Arial" w:hAnsi="Arial" w:cs="Arial"/>
-          <w:sz w:val="16"/>
-          <w:szCs w:val="16"/>
-          <w:lang w:val="ru-RU"/>
-        </w:rPr>
-        <w:t xml:space="preserve"> </w:t>
-      </w:r>
-      <w:r>
-        <w:rPr>
-          <w:rFonts w:ascii="Arial" w:hAnsi="Arial" w:cs="Arial"/>
-          <w:sz w:val="16"/>
-          <w:szCs w:val="16"/>
-          <w:lang w:val="ru-RU"/>
-        </w:rPr>
-        <w:t>различных ИТЛ</w:t>
-      </w:r>
-      <w:r>
-        <w:rPr>
-          <w:rFonts w:ascii="Arial" w:hAnsi="Arial" w:cs="Arial"/>
-          <w:sz w:val="16"/>
-          <w:szCs w:val="16"/>
-          <w:lang w:val="ru-RU"/>
-        </w:rPr>
-        <w:t>.</w:t>
-      </w:r>
-    </w:p>
-    <w:p>
-      <w:pPr>
-        <w:rPr>
-          <w:rFonts w:ascii="Arial" w:hAnsi="Arial" w:cs="Arial"/>
-          <w:sz w:val="16"/>
-          <w:szCs w:val="16"/>
-          <w:lang w:val="ru-RU"/>
-        </w:rPr>
-      </w:pPr>
-      <w:r>
-        <w:rPr>
-          <w:rFonts w:ascii="Arial" w:hAnsi="Arial" w:cs="Arial"/>
-          <w:sz w:val="16"/>
-          <w:szCs w:val="16"/>
-          <w:lang w:val="ru-RU"/>
-        </w:rPr>
-        <w:t>К</w:t>
-      </w:r>
-      <w:r>
-        <w:rPr>
-          <w:rFonts w:ascii="Arial" w:hAnsi="Arial" w:cs="Arial"/>
-          <w:sz w:val="16"/>
-          <w:szCs w:val="16"/>
-          <w:lang w:val="ru-RU"/>
-        </w:rPr>
-        <w:t xml:space="preserve">азненная </w:t>
-      </w:r>
-      <w:r>
-        <w:rPr>
-          <w:rFonts w:ascii="Arial" w:hAnsi="Arial" w:cs="Arial"/>
-          <w:sz w:val="16"/>
-          <w:szCs w:val="16"/>
-          <w:lang w:val="ru-RU"/>
-        </w:rPr>
-        <w:t xml:space="preserve">в </w:t>
-      </w:r>
-      <w:r>
-        <w:rPr>
-          <w:rFonts w:ascii="Arial" w:hAnsi="Arial" w:cs="Arial"/>
-          <w:sz w:val="16"/>
-          <w:szCs w:val="16"/>
-          <w:lang w:val="ru-RU"/>
-        </w:rPr>
-        <w:t>рамках приказа 00447</w:t>
-      </w:r>
-      <w:r>
-        <w:rPr>
-          <w:rFonts w:ascii="Arial" w:hAnsi="Arial" w:cs="Arial"/>
-          <w:sz w:val="16"/>
-          <w:szCs w:val="16"/>
-          <w:lang w:val="ru-RU"/>
-        </w:rPr>
-        <w:t xml:space="preserve"> </w:t>
-      </w:r>
-      <w:r>
-        <w:rPr>
-          <w:rFonts w:ascii="Arial" w:hAnsi="Arial" w:cs="Arial"/>
-          <w:sz w:val="16"/>
-          <w:szCs w:val="16"/>
-          <w:lang w:val="ru-RU"/>
-        </w:rPr>
-        <w:t xml:space="preserve">женщина была </w:t>
-      </w:r>
-      <w:r>
-        <w:rPr>
-          <w:rFonts w:ascii="Arial" w:hAnsi="Arial" w:cs="Arial"/>
-          <w:sz w:val="16"/>
-          <w:szCs w:val="16"/>
-          <w:lang w:val="ru-RU"/>
-        </w:rPr>
-        <w:t>на 6 месяце беременности</w:t>
-      </w:r>
-      <w:r>
-        <w:rPr>
-          <w:rFonts w:ascii="Arial" w:hAnsi="Arial" w:cs="Arial"/>
-          <w:sz w:val="16"/>
-          <w:szCs w:val="16"/>
-          <w:lang w:val="ru-RU"/>
-        </w:rPr>
-        <w:t>.</w:t>
-      </w:r>
-    </w:p>
-    <w:p>
-      <w:pPr>
-        <w:rPr>
-          <w:rFonts w:ascii="Arial" w:hAnsi="Arial" w:cs="Arial"/>
-          <w:sz w:val="16"/>
-          <w:szCs w:val="16"/>
-          <w:lang w:val="ru-RU"/>
-        </w:rPr>
-      </w:pPr>
-      <w:r>
-        <w:rPr>
-          <w:rFonts w:ascii="Arial" w:hAnsi="Arial" w:cs="Arial"/>
-          <w:b/>
-          <w:bCs/>
-          <w:sz w:val="16"/>
-          <w:szCs w:val="16"/>
-          <w:u w:val="single"/>
-          <w:lang w:val="ru-RU"/>
-        </w:rPr>
-        <w:t>Партийность:</w:t>
-      </w:r>
-      <w:r>
-        <w:rPr>
-          <w:rFonts w:ascii="Arial" w:hAnsi="Arial" w:cs="Arial"/>
-          <w:sz w:val="16"/>
-          <w:szCs w:val="16"/>
-          <w:lang w:val="ru-RU"/>
-        </w:rPr>
-        <w:t xml:space="preserve"> </w:t>
-      </w:r>
-      <w:r>
-        <w:rPr>
-          <w:rFonts w:ascii="Arial" w:hAnsi="Arial" w:cs="Arial"/>
-          <w:sz w:val="16"/>
-          <w:szCs w:val="16"/>
-          <w:lang w:val="ru-RU"/>
-        </w:rPr>
-        <w:t>б</w:t>
-      </w:r>
-      <w:r>
-        <w:rPr>
-          <w:rFonts w:ascii="Arial" w:hAnsi="Arial" w:cs="Arial"/>
-          <w:sz w:val="16"/>
-          <w:szCs w:val="16"/>
-          <w:lang w:val="ru-RU"/>
-        </w:rPr>
-        <w:t>еспартийн</w:t>
-      </w:r>
-      <w:r>
-        <w:rPr>
-          <w:rFonts w:ascii="Arial" w:hAnsi="Arial" w:cs="Arial"/>
-          <w:sz w:val="16"/>
-          <w:szCs w:val="16"/>
-          <w:lang w:val="ru-RU"/>
-        </w:rPr>
-        <w:t>ая</w:t>
-      </w:r>
-      <w:r>
-        <w:rPr>
-          <w:rFonts w:ascii="Arial" w:hAnsi="Arial" w:cs="Arial"/>
-          <w:sz w:val="16"/>
-          <w:szCs w:val="16"/>
-          <w:lang w:val="ru-RU"/>
-        </w:rPr>
-        <w:t xml:space="preserve"> – </w:t>
-      </w:r>
-      <w:r>
-        <w:rPr>
-          <w:rFonts w:ascii="Arial" w:hAnsi="Arial" w:cs="Arial"/>
-          <w:sz w:val="16"/>
-          <w:szCs w:val="16"/>
-          <w:lang w:val="ru-RU"/>
-        </w:rPr>
-        <w:t>5</w:t>
-      </w:r>
-      <w:r>
-        <w:rPr>
-          <w:rFonts w:ascii="Arial" w:hAnsi="Arial" w:cs="Arial"/>
-          <w:sz w:val="16"/>
-          <w:szCs w:val="16"/>
-          <w:lang w:val="ru-RU"/>
-        </w:rPr>
-        <w:t xml:space="preserve">. </w:t>
-      </w:r>
-    </w:p>
-    <w:p>
-      <w:pPr>
-        <w:rPr>
-          <w:rFonts w:ascii="Arial" w:hAnsi="Arial" w:cs="Arial"/>
-          <w:sz w:val="16"/>
-          <w:szCs w:val="16"/>
-          <w:lang w:val="ru-RU"/>
-        </w:rPr>
-      </w:pPr>
-      <w:r>
-        <w:rPr>
-          <w:rFonts w:ascii="Arial" w:hAnsi="Arial" w:cs="Arial"/>
-          <w:b/>
-          <w:bCs/>
-          <w:sz w:val="16"/>
-          <w:szCs w:val="16"/>
-          <w:u w:val="single"/>
-          <w:lang w:val="ru-RU"/>
-        </w:rPr>
-        <w:t>Образование</w:t>
-      </w:r>
-      <w:r>
-        <w:rPr>
-          <w:rFonts w:ascii="Arial" w:hAnsi="Arial" w:cs="Arial"/>
-          <w:sz w:val="16"/>
-          <w:szCs w:val="16"/>
-          <w:lang w:val="ru-RU"/>
-        </w:rPr>
-        <w:t>:</w:t>
-      </w:r>
-      <w:r>
-        <w:rPr>
-          <w:rFonts w:ascii="Arial" w:hAnsi="Arial" w:cs="Arial"/>
-          <w:sz w:val="16"/>
-          <w:szCs w:val="16"/>
-          <w:lang w:val="ru-RU"/>
-        </w:rPr>
-        <w:t xml:space="preserve"> н</w:t>
-      </w:r>
-      <w:r>
-        <w:rPr>
-          <w:rFonts w:ascii="Arial" w:hAnsi="Arial" w:cs="Arial"/>
-          <w:sz w:val="16"/>
-          <w:szCs w:val="16"/>
-          <w:lang w:val="ru-RU"/>
-        </w:rPr>
-        <w:t>еграмотная – 5</w:t>
-      </w:r>
-      <w:r>
-        <w:rPr>
-          <w:rFonts w:ascii="Arial" w:hAnsi="Arial" w:cs="Arial"/>
-          <w:sz w:val="16"/>
-          <w:szCs w:val="16"/>
-          <w:lang w:val="ru-RU"/>
-        </w:rPr>
-        <w:t xml:space="preserve">; </w:t>
-      </w:r>
-      <w:r>
-        <w:rPr>
-          <w:rFonts w:ascii="Arial" w:hAnsi="Arial" w:cs="Arial"/>
-          <w:sz w:val="16"/>
-          <w:szCs w:val="16"/>
-          <w:lang w:val="ru-RU"/>
-        </w:rPr>
-        <w:t xml:space="preserve">среднее </w:t>
-      </w:r>
-      <w:r>
-        <w:rPr>
-          <w:rFonts w:ascii="Arial" w:hAnsi="Arial" w:cs="Arial"/>
-          <w:sz w:val="16"/>
-          <w:szCs w:val="16"/>
-          <w:lang w:val="ru-RU"/>
-        </w:rPr>
-        <w:t>–</w:t>
-      </w:r>
-      <w:r>
-        <w:rPr>
-          <w:rFonts w:ascii="Arial" w:hAnsi="Arial" w:cs="Arial"/>
-          <w:sz w:val="16"/>
-          <w:szCs w:val="16"/>
-          <w:lang w:val="ru-RU"/>
-        </w:rPr>
-        <w:t xml:space="preserve"> 1</w:t>
-      </w:r>
-      <w:r>
-        <w:rPr>
-          <w:rFonts w:ascii="Arial" w:hAnsi="Arial" w:cs="Arial"/>
-          <w:sz w:val="16"/>
-          <w:szCs w:val="16"/>
-          <w:lang w:val="ru-RU"/>
-        </w:rPr>
-        <w:t>.</w:t>
-      </w:r>
-      <w:r>
-        <w:rPr>
-          <w:rFonts w:ascii="Arial" w:hAnsi="Arial" w:cs="Arial"/>
-          <w:sz w:val="16"/>
-          <w:szCs w:val="16"/>
-          <w:lang w:val="ru-RU"/>
-        </w:rPr>
-        <w:t xml:space="preserve"> </w:t>
-      </w:r>
-    </w:p>
-    <w:p>
-      <w:pPr>
-        <w:rPr>
-          <w:rFonts w:ascii="Arial" w:hAnsi="Arial" w:cs="Arial"/>
-          <w:sz w:val="16"/>
-          <w:szCs w:val="16"/>
-          <w:lang w:val="ru-RU"/>
-        </w:rPr>
-      </w:pPr>
-      <w:r>
-        <w:rPr>
-          <w:rFonts w:ascii="Arial" w:hAnsi="Arial" w:cs="Arial"/>
-          <w:b/>
-          <w:bCs/>
-          <w:sz w:val="16"/>
-          <w:szCs w:val="16"/>
-          <w:u w:val="single"/>
-          <w:lang w:val="ru-RU"/>
-        </w:rPr>
-        <w:t>Профессия/социальная страта:</w:t>
-      </w:r>
-      <w:r>
-        <w:rPr>
-          <w:rFonts w:ascii="Arial" w:hAnsi="Arial" w:cs="Arial"/>
-          <w:sz w:val="16"/>
-          <w:szCs w:val="16"/>
-          <w:lang w:val="ru-RU"/>
-        </w:rPr>
-        <w:t xml:space="preserve"> </w:t>
-      </w:r>
-      <w:r>
-        <w:rPr>
-          <w:rFonts w:ascii="Arial" w:hAnsi="Arial" w:cs="Arial"/>
-          <w:sz w:val="16"/>
-          <w:szCs w:val="16"/>
-          <w:lang w:val="ru-RU"/>
-        </w:rPr>
-        <w:t xml:space="preserve">БОЗ/БОМЖ </w:t>
-      </w:r>
-      <w:r>
-        <w:rPr>
-          <w:rFonts w:ascii="Arial" w:hAnsi="Arial" w:cs="Arial"/>
-          <w:sz w:val="16"/>
-          <w:szCs w:val="16"/>
-          <w:lang w:val="ru-RU"/>
-        </w:rPr>
-        <w:t>–</w:t>
-      </w:r>
-      <w:r>
-        <w:rPr>
-          <w:rFonts w:ascii="Arial" w:hAnsi="Arial" w:cs="Arial"/>
-          <w:sz w:val="16"/>
-          <w:szCs w:val="16"/>
-          <w:lang w:val="ru-RU"/>
-        </w:rPr>
-        <w:t xml:space="preserve"> 10</w:t>
-      </w:r>
-    </w:p>
-    <w:p>
-      <w:pPr>
-        <w:rPr>
-          <w:rFonts w:ascii="Arial" w:hAnsi="Arial" w:cs="Arial"/>
-          <w:sz w:val="16"/>
-          <w:szCs w:val="16"/>
+          <w:sz w:val="18"/>
+          <w:szCs w:val="18"/>
           <w:lang w:val="ru-RU"/>
         </w:rPr>
       </w:pPr>
@@ -2135,7 +1918,6 @@
                 <w:szCs w:val="16"/>
                 <w:lang w:val="ru-RU"/>
               </w:rPr>
-              <w:lastRenderedPageBreak/>
               <w:t>Вайданович</w:t>
             </w:r>
             <w:proofErr w:type="spellEnd"/>
@@ -2190,6 +1972,7 @@
                 <w:szCs w:val="16"/>
                 <w:lang w:val="ru-RU"/>
               </w:rPr>
+              <w:lastRenderedPageBreak/>
               <w:t>1877 г.</w:t>
             </w:r>
             <w:r>
@@ -2751,6 +2534,7 @@
                 <w:szCs w:val="16"/>
                 <w:lang w:val="ru-RU"/>
               </w:rPr>
+              <w:lastRenderedPageBreak/>
               <w:t>Вайданович</w:t>
             </w:r>
             <w:proofErr w:type="spellEnd"/>
@@ -6531,6 +6315,25 @@
       <w:suppressLineNumbers/>
     </w:pPr>
   </w:style>
+  <w:style w:type="table" w:styleId="TableGrid">
+    <w:name w:val="Table Grid"/>
+    <w:basedOn w:val="TableNormal"/>
+    <w:uiPriority w:val="39"/>
+    <w:rsid w:val="004E6617"/>
+    <w:pPr>
+      <w:spacing w:after="0" w:line="240" w:lineRule="auto"/>
+    </w:pPr>
+    <w:tblPr>
+      <w:tblBorders>
+        <w:top w:val="single" w:sz="4" w:space="0" w:color="auto"/>
+        <w:left w:val="single" w:sz="4" w:space="0" w:color="auto"/>
+        <w:bottom w:val="single" w:sz="4" w:space="0" w:color="auto"/>
+        <w:right w:val="single" w:sz="4" w:space="0" w:color="auto"/>
+        <w:insideH w:val="single" w:sz="4" w:space="0" w:color="auto"/>
+        <w:insideV w:val="single" w:sz="4" w:space="0" w:color="auto"/>
+      </w:tblBorders>
+    </w:tblPr>
+  </w:style>
 </w:styles>
 </file>
 

</xml_diff>